<commit_message>
feat: add weekly lesson plans, organizational documents, and update gitignore for data management.
</commit_message>
<xml_diff>
--- a/docs/semanarios/2026-09/semanario-rafael-martins-2026-09-07-a-11-semana-b.docx
+++ b/docs/semanarios/2026-09/semanario-rafael-martins-2026-09-07-a-11-semana-b.docx
@@ -2,7 +2,7 @@
 <file path=word/document.xml><?xml version="1.0" encoding="utf-8"?>
 <w:document xmlns:w="http://schemas.openxmlformats.org/wordprocessingml/2006/main" xmlns:m="http://schemas.openxmlformats.org/officeDocument/2006/math" xmlns:r="http://schemas.openxmlformats.org/officeDocument/2006/relationships" xmlns:o="urn:schemas-microsoft-com:office:office" xmlns:v="urn:schemas-microsoft-com:vml" xmlns:w10="urn:schemas-microsoft-com:office:word" xmlns:a="http://schemas.openxmlformats.org/drawingml/2006/main" xmlns:pic="http://schemas.openxmlformats.org/drawingml/2006/picture" xmlns:wp="http://schemas.openxmlformats.org/drawingml/2006/wordprocessingDrawing">
   <w:body>
-    <w:bookmarkStart w:id="17" w:name="X2fa6ad1018f724a891b8506b95c64dccde73840"/>
+    <w:bookmarkStart w:id="18" w:name="X2fa6ad1018f724a891b8506b95c64dccde73840"/>
     <w:p>
       <w:pPr>
         <w:pStyle w:val="Heading1"/>
@@ -438,16 +438,289 @@
       </w:tr>
     </w:tbl>
     <w:bookmarkEnd w:id="10"/>
-    <w:bookmarkStart w:id="15" w:name="planos-de-aula"/>
+    <w:bookmarkStart w:id="11" w:name="quantitativo-de-alunos-e-cópias"/>
     <w:p>
       <w:pPr>
         <w:pStyle w:val="Heading2"/>
       </w:pPr>
       <w:r>
+        <w:t xml:space="preserve">Quantitativo de alunos e cópias</w:t>
+      </w:r>
+    </w:p>
+    <w:tbl>
+      <w:tblPr>
+        <w:tblStyle w:val="Table"/>
+        <w:tblW w:type="auto" w:w="0"/>
+        <w:tblLook w:firstRow="1" w:lastRow="0" w:firstColumn="0" w:lastColumn="0" w:noHBand="0" w:noVBand="0" w:val="0020"/>
+      </w:tblPr>
+      <w:tblGrid>
+        <w:gridCol w:w="2640"/>
+        <w:gridCol w:w="2640"/>
+        <w:gridCol w:w="2640"/>
+      </w:tblGrid>
+      <w:tr>
+        <w:trPr>
+          <w:tblHeader w:val="on"/>
+        </w:trPr>
+        <w:tc>
+          <w:tcPr/>
+          <w:p>
+            <w:pPr>
+              <w:pStyle w:val="Compact"/>
+            </w:pPr>
+            <w:r>
+              <w:t xml:space="preserve">Turma</w:t>
+            </w:r>
+          </w:p>
+        </w:tc>
+        <w:tc>
+          <w:tcPr/>
+          <w:p>
+            <w:pPr>
+              <w:pStyle w:val="Compact"/>
+              <w:jc w:val="right"/>
+            </w:pPr>
+            <w:r>
+              <w:t xml:space="preserve">Alunos</w:t>
+            </w:r>
+          </w:p>
+        </w:tc>
+        <w:tc>
+          <w:tcPr/>
+          <w:p>
+            <w:pPr>
+              <w:pStyle w:val="Compact"/>
+            </w:pPr>
+            <w:r>
+              <w:t xml:space="preserve">Cópias avulsas para preparar</w:t>
+            </w:r>
+          </w:p>
+        </w:tc>
+      </w:tr>
+      <w:tr>
+        <w:tc>
+          <w:tcPr/>
+          <w:p>
+            <w:pPr>
+              <w:pStyle w:val="Compact"/>
+            </w:pPr>
+            <w:r>
+              <w:t xml:space="preserve">3ºD</w:t>
+            </w:r>
+          </w:p>
+        </w:tc>
+        <w:tc>
+          <w:tcPr/>
+          <w:p>
+            <w:pPr>
+              <w:pStyle w:val="Compact"/>
+              <w:jc w:val="right"/>
+            </w:pPr>
+            <w:r>
+              <w:t xml:space="preserve">15</w:t>
+            </w:r>
+          </w:p>
+        </w:tc>
+        <w:tc>
+          <w:tcPr/>
+          <w:p>
+            <w:pPr>
+              <w:pStyle w:val="Compact"/>
+            </w:pPr>
+            <w:r>
+              <w:t xml:space="preserve">Ficha do camaleão:</w:t>
+            </w:r>
+            <w:r>
+              <w:t xml:space="preserve"> </w:t>
+            </w:r>
+            <w:r>
+              <w:rPr>
+                <w:b/>
+                <w:bCs/>
+              </w:rPr>
+              <w:t xml:space="preserve">15</w:t>
+            </w:r>
+          </w:p>
+        </w:tc>
+      </w:tr>
+      <w:tr>
+        <w:tc>
+          <w:tcPr/>
+          <w:p>
+            <w:pPr>
+              <w:pStyle w:val="Compact"/>
+            </w:pPr>
+            <w:r>
+              <w:t xml:space="preserve">4ºC</w:t>
+            </w:r>
+          </w:p>
+        </w:tc>
+        <w:tc>
+          <w:tcPr/>
+          <w:p>
+            <w:pPr>
+              <w:pStyle w:val="Compact"/>
+              <w:jc w:val="right"/>
+            </w:pPr>
+            <w:r>
+              <w:t xml:space="preserve">19</w:t>
+            </w:r>
+          </w:p>
+        </w:tc>
+        <w:tc>
+          <w:tcPr/>
+          <w:p>
+            <w:pPr>
+              <w:pStyle w:val="Compact"/>
+            </w:pPr>
+            <w:r>
+              <w:t xml:space="preserve">a especificar no material da aula</w:t>
+            </w:r>
+          </w:p>
+        </w:tc>
+      </w:tr>
+      <w:tr>
+        <w:tc>
+          <w:tcPr/>
+          <w:p>
+            <w:pPr>
+              <w:pStyle w:val="Compact"/>
+            </w:pPr>
+            <w:r>
+              <w:t xml:space="preserve">2ºC</w:t>
+            </w:r>
+          </w:p>
+        </w:tc>
+        <w:tc>
+          <w:tcPr/>
+          <w:p>
+            <w:pPr>
+              <w:pStyle w:val="Compact"/>
+              <w:jc w:val="right"/>
+            </w:pPr>
+            <w:r>
+              <w:t xml:space="preserve">11</w:t>
+            </w:r>
+          </w:p>
+        </w:tc>
+        <w:tc>
+          <w:tcPr/>
+          <w:p>
+            <w:pPr>
+              <w:pStyle w:val="Compact"/>
+            </w:pPr>
+            <w:r>
+              <w:t xml:space="preserve">a especificar no material da aula</w:t>
+            </w:r>
+          </w:p>
+        </w:tc>
+      </w:tr>
+      <w:tr>
+        <w:tc>
+          <w:tcPr/>
+          <w:p>
+            <w:pPr>
+              <w:pStyle w:val="Compact"/>
+            </w:pPr>
+            <w:r>
+              <w:t xml:space="preserve">3ºA</w:t>
+            </w:r>
+          </w:p>
+        </w:tc>
+        <w:tc>
+          <w:tcPr/>
+          <w:p>
+            <w:pPr>
+              <w:pStyle w:val="Compact"/>
+              <w:jc w:val="right"/>
+            </w:pPr>
+            <w:r>
+              <w:t xml:space="preserve">18</w:t>
+            </w:r>
+          </w:p>
+        </w:tc>
+        <w:tc>
+          <w:tcPr/>
+          <w:p>
+            <w:pPr>
+              <w:pStyle w:val="Compact"/>
+            </w:pPr>
+            <w:r>
+              <w:t xml:space="preserve">Ficha do camaleão:</w:t>
+            </w:r>
+            <w:r>
+              <w:t xml:space="preserve"> </w:t>
+            </w:r>
+            <w:r>
+              <w:rPr>
+                <w:b/>
+                <w:bCs/>
+              </w:rPr>
+              <w:t xml:space="preserve">18</w:t>
+            </w:r>
+          </w:p>
+        </w:tc>
+      </w:tr>
+      <w:tr>
+        <w:tc>
+          <w:tcPr/>
+          <w:p>
+            <w:pPr>
+              <w:pStyle w:val="Compact"/>
+            </w:pPr>
+            <w:r>
+              <w:rPr>
+                <w:b/>
+                <w:bCs/>
+              </w:rPr>
+              <w:t xml:space="preserve">Total</w:t>
+            </w:r>
+          </w:p>
+        </w:tc>
+        <w:tc>
+          <w:tcPr/>
+          <w:p>
+            <w:pPr>
+              <w:pStyle w:val="Compact"/>
+              <w:jc w:val="right"/>
+            </w:pPr>
+            <w:r>
+              <w:rPr>
+                <w:b/>
+                <w:bCs/>
+              </w:rPr>
+              <w:t xml:space="preserve">63</w:t>
+            </w:r>
+          </w:p>
+        </w:tc>
+        <w:tc>
+          <w:tcPr/>
+          <w:p>
+            <w:pPr>
+              <w:pStyle w:val="Compact"/>
+            </w:pPr>
+            <w:r>
+              <w:rPr>
+                <w:b/>
+                <w:bCs/>
+              </w:rPr>
+              <w:t xml:space="preserve">33 cópias da ficha do camaleão</w:t>
+            </w:r>
+          </w:p>
+        </w:tc>
+      </w:tr>
+    </w:tbl>
+    <w:bookmarkEnd w:id="11"/>
+    <w:bookmarkStart w:id="16" w:name="planos-de-aula"/>
+    <w:p>
+      <w:pPr>
+        <w:pStyle w:val="Heading2"/>
+      </w:pPr>
+      <w:r>
         <w:t xml:space="preserve">Planos de aula</w:t>
       </w:r>
     </w:p>
-    <w:bookmarkStart w:id="11" w:name="ºd-0809-12551435"/>
+    <w:bookmarkStart w:id="12" w:name="ºd-0809-12551435"/>
     <w:p>
       <w:pPr>
         <w:pStyle w:val="Heading3"/>
@@ -700,8 +973,8 @@
         <w:t xml:space="preserve">Adaptação: se a turma não tiver concluído “O que é cor?”, realizar uma retomada guiada e preservar Cores na arte como atividade principal.</w:t>
       </w:r>
     </w:p>
-    <w:bookmarkEnd w:id="11"/>
-    <w:bookmarkStart w:id="12" w:name="ºc-1009-12551435"/>
+    <w:bookmarkEnd w:id="12"/>
+    <w:bookmarkStart w:id="13" w:name="ºc-1009-12551435"/>
     <w:p>
       <w:pPr>
         <w:pStyle w:val="Heading3"/>
@@ -930,8 +1203,8 @@
         </w:tc>
       </w:tr>
     </w:tbl>
-    <w:bookmarkEnd w:id="12"/>
-    <w:bookmarkStart w:id="13" w:name="ºc-1009-15451725"/>
+    <w:bookmarkEnd w:id="13"/>
+    <w:bookmarkStart w:id="14" w:name="ºc-1009-15451725"/>
     <w:p>
       <w:pPr>
         <w:pStyle w:val="Heading3"/>
@@ -1160,8 +1433,8 @@
         </w:tc>
       </w:tr>
     </w:tbl>
-    <w:bookmarkEnd w:id="13"/>
-    <w:bookmarkStart w:id="14" w:name="ºa-1109-07150855"/>
+    <w:bookmarkEnd w:id="14"/>
+    <w:bookmarkStart w:id="15" w:name="ºa-1109-07150855"/>
     <w:p>
       <w:pPr>
         <w:pStyle w:val="Heading3"/>
@@ -1194,9 +1467,9 @@
         <w:t xml:space="preserve">como a experiência principal. Registrar diferenças de ritmo ou de retomada para não presumir equivalência entre as turmas.</w:t>
       </w:r>
     </w:p>
-    <w:bookmarkEnd w:id="14"/>
     <w:bookmarkEnd w:id="15"/>
-    <w:bookmarkStart w:id="16" w:name="registro-pós-aula"/>
+    <w:bookmarkEnd w:id="16"/>
+    <w:bookmarkStart w:id="17" w:name="registro-pós-aula"/>
     <w:p>
       <w:pPr>
         <w:pStyle w:val="Heading2"/>
@@ -1229,8 +1502,8 @@
         <w:t xml:space="preserve">O 1ºC permanece sem conteúdo oficial nesta semana por causa do feriado.</w:t>
       </w:r>
     </w:p>
-    <w:bookmarkEnd w:id="16"/>
     <w:bookmarkEnd w:id="17"/>
+    <w:bookmarkEnd w:id="18"/>
     <w:sectPr>
       <w:footnotePr>
         <w:numRestart w:val="eachSect"/>

</xml_diff>